<commit_message>
feat(qc): per-step CLI flags + timestamp-normalized comparator; regen TFLs
run_reproducibility_check.R
- Add --raw/--sdtm/--adam/--define/--tfl flags (default: all). For skipped
  upstream steps, seed committed outputs into staging so partial runs work
  (e.g. --tfl alone still has SDTM/ADaM/define available as inputs).
- Switch step runner from system("cd && Rscript") to system2 + setwd
  (Windows portability — the "cd && ..." form failed under the user's shell).
- Normalize render-time tokens before text comparison: DRAFT_TAG date,
  flextable HTML cl-<hex> IDs, Define-XML CreationDateTime/AsOfDateTime/
  FileOID timestamps. Compare only outputs of steps actually re-run.

tfl/
- Regenerate all 119 artefacts (114 tables x 3 formats + 6 figures + 2
  rollups) from current code. After regen, --tfl reproducibility check
  reports 81/81 MATCH.

Co-Authored-By: Claude Opus 4.7 (1M context) <noreply@anthropic.com>
</commit_message>
<xml_diff>
--- a/tfl/TFL-OUTPUTS.docx
+++ b/tfl/TFL-OUTPUTS.docx
@@ -1323,7 +1323,7 @@
           <w:szCs w:val="18"/>
           <w:color w:val="C0392B"/>
         </w:rPr>
-        <w:t xml:space="preserve">DRAFT — produced 2026-05-17 — synthetic data, NOT for regulatory submission</w:t>
+        <w:t xml:space="preserve">DRAFT — produced 2026-06-05 — synthetic data, NOT for regulatory submission</w:t>
       </w:r>
     </w:p>
     <w:p>
@@ -1501,7 +1501,7 @@
           <w:szCs w:val="14"/>
           <w:color w:val="C0392B"/>
         </w:rPr>
-        <w:t xml:space="preserve">DRAFT — produced 2026-05-17 — synthetic data, NOT for regulatory submission</w:t>
+        <w:t xml:space="preserve">DRAFT — produced 2026-06-05 — synthetic data, NOT for regulatory submission</w:t>
       </w:r>
     </w:p>
     <w:p>
@@ -1679,7 +1679,7 @@
           <w:szCs w:val="14"/>
           <w:color w:val="C0392B"/>
         </w:rPr>
-        <w:t xml:space="preserve">DRAFT — produced 2026-05-17 — synthetic data, NOT for regulatory submission</w:t>
+        <w:t xml:space="preserve">DRAFT — produced 2026-06-05 — synthetic data, NOT for regulatory submission</w:t>
       </w:r>
     </w:p>
     <w:p>
@@ -1857,7 +1857,7 @@
           <w:szCs w:val="14"/>
           <w:color w:val="C0392B"/>
         </w:rPr>
-        <w:t xml:space="preserve">DRAFT — produced 2026-05-17 — synthetic data, NOT for regulatory submission</w:t>
+        <w:t xml:space="preserve">DRAFT — produced 2026-06-05 — synthetic data, NOT for regulatory submission</w:t>
       </w:r>
     </w:p>
     <w:p>
@@ -2035,7 +2035,7 @@
           <w:szCs w:val="14"/>
           <w:color w:val="C0392B"/>
         </w:rPr>
-        <w:t xml:space="preserve">DRAFT — produced 2026-05-17 — synthetic data, NOT for regulatory submission</w:t>
+        <w:t xml:space="preserve">DRAFT — produced 2026-06-05 — synthetic data, NOT for regulatory submission</w:t>
       </w:r>
     </w:p>
     <w:p>
@@ -2213,7 +2213,7 @@
           <w:szCs w:val="14"/>
           <w:color w:val="C0392B"/>
         </w:rPr>
-        <w:t xml:space="preserve">DRAFT — produced 2026-05-17 — synthetic data, NOT for regulatory submission</w:t>
+        <w:t xml:space="preserve">DRAFT — produced 2026-06-05 — synthetic data, NOT for regulatory submission</w:t>
       </w:r>
     </w:p>
     <w:p>
@@ -2391,7 +2391,7 @@
           <w:szCs w:val="14"/>
           <w:color w:val="C0392B"/>
         </w:rPr>
-        <w:t xml:space="preserve">DRAFT — produced 2026-05-17 — synthetic data, NOT for regulatory submission</w:t>
+        <w:t xml:space="preserve">DRAFT — produced 2026-06-05 — synthetic data, NOT for regulatory submission</w:t>
       </w:r>
     </w:p>
     <w:p>
@@ -2569,7 +2569,7 @@
           <w:szCs w:val="14"/>
           <w:color w:val="C0392B"/>
         </w:rPr>
-        <w:t xml:space="preserve">DRAFT — produced 2026-05-17 — synthetic data, NOT for regulatory submission</w:t>
+        <w:t xml:space="preserve">DRAFT — produced 2026-06-05 — synthetic data, NOT for regulatory submission</w:t>
       </w:r>
     </w:p>
     <w:p>
@@ -2747,7 +2747,7 @@
           <w:szCs w:val="14"/>
           <w:color w:val="C0392B"/>
         </w:rPr>
-        <w:t xml:space="preserve">DRAFT — produced 2026-05-17 — synthetic data, NOT for regulatory submission</w:t>
+        <w:t xml:space="preserve">DRAFT — produced 2026-06-05 — synthetic data, NOT for regulatory submission</w:t>
       </w:r>
     </w:p>
     <w:p>
@@ -2925,7 +2925,7 @@
           <w:szCs w:val="14"/>
           <w:color w:val="C0392B"/>
         </w:rPr>
-        <w:t xml:space="preserve">DRAFT — produced 2026-05-17 — synthetic data, NOT for regulatory submission</w:t>
+        <w:t xml:space="preserve">DRAFT — produced 2026-06-05 — synthetic data, NOT for regulatory submission</w:t>
       </w:r>
     </w:p>
     <w:p>
@@ -3103,7 +3103,7 @@
           <w:szCs w:val="14"/>
           <w:color w:val="C0392B"/>
         </w:rPr>
-        <w:t xml:space="preserve">DRAFT — produced 2026-05-17 — synthetic data, NOT for regulatory submission</w:t>
+        <w:t xml:space="preserve">DRAFT — produced 2026-06-05 — synthetic data, NOT for regulatory submission</w:t>
       </w:r>
     </w:p>
     <w:p>
@@ -3281,7 +3281,7 @@
           <w:szCs w:val="14"/>
           <w:color w:val="C0392B"/>
         </w:rPr>
-        <w:t xml:space="preserve">DRAFT — produced 2026-05-17 — synthetic data, NOT for regulatory submission</w:t>
+        <w:t xml:space="preserve">DRAFT — produced 2026-06-05 — synthetic data, NOT for regulatory submission</w:t>
       </w:r>
     </w:p>
     <w:p>
@@ -3459,7 +3459,7 @@
           <w:szCs w:val="14"/>
           <w:color w:val="C0392B"/>
         </w:rPr>
-        <w:t xml:space="preserve">DRAFT — produced 2026-05-17 — synthetic data, NOT for regulatory submission</w:t>
+        <w:t xml:space="preserve">DRAFT — produced 2026-06-05 — synthetic data, NOT for regulatory submission</w:t>
       </w:r>
     </w:p>
     <w:p>
@@ -3637,7 +3637,7 @@
           <w:szCs w:val="14"/>
           <w:color w:val="C0392B"/>
         </w:rPr>
-        <w:t xml:space="preserve">DRAFT — produced 2026-05-17 — synthetic data, NOT for regulatory submission</w:t>
+        <w:t xml:space="preserve">DRAFT — produced 2026-06-05 — synthetic data, NOT for regulatory submission</w:t>
       </w:r>
     </w:p>
     <w:p>
@@ -3815,7 +3815,7 @@
           <w:szCs w:val="14"/>
           <w:color w:val="C0392B"/>
         </w:rPr>
-        <w:t xml:space="preserve">DRAFT — produced 2026-05-17 — synthetic data, NOT for regulatory submission</w:t>
+        <w:t xml:space="preserve">DRAFT — produced 2026-06-05 — synthetic data, NOT for regulatory submission</w:t>
       </w:r>
     </w:p>
     <w:p>
@@ -3993,7 +3993,7 @@
           <w:szCs w:val="14"/>
           <w:color w:val="C0392B"/>
         </w:rPr>
-        <w:t xml:space="preserve">DRAFT — produced 2026-05-17 — synthetic data, NOT for regulatory submission</w:t>
+        <w:t xml:space="preserve">DRAFT — produced 2026-06-05 — synthetic data, NOT for regulatory submission</w:t>
       </w:r>
     </w:p>
     <w:p>
@@ -4171,7 +4171,7 @@
           <w:szCs w:val="14"/>
           <w:color w:val="C0392B"/>
         </w:rPr>
-        <w:t xml:space="preserve">DRAFT — produced 2026-05-17 — synthetic data, NOT for regulatory submission</w:t>
+        <w:t xml:space="preserve">DRAFT — produced 2026-06-05 — synthetic data, NOT for regulatory submission</w:t>
       </w:r>
     </w:p>
     <w:p>
@@ -4349,7 +4349,7 @@
           <w:szCs w:val="14"/>
           <w:color w:val="C0392B"/>
         </w:rPr>
-        <w:t xml:space="preserve">DRAFT — produced 2026-05-17 — synthetic data, NOT for regulatory submission</w:t>
+        <w:t xml:space="preserve">DRAFT — produced 2026-06-05 — synthetic data, NOT for regulatory submission</w:t>
       </w:r>
     </w:p>
     <w:p>
@@ -4527,7 +4527,7 @@
           <w:szCs w:val="14"/>
           <w:color w:val="C0392B"/>
         </w:rPr>
-        <w:t xml:space="preserve">DRAFT — produced 2026-05-17 — synthetic data, NOT for regulatory submission</w:t>
+        <w:t xml:space="preserve">DRAFT — produced 2026-06-05 — synthetic data, NOT for regulatory submission</w:t>
       </w:r>
     </w:p>
     <w:p>
@@ -4724,7 +4724,7 @@
           <w:szCs w:val="14"/>
           <w:color w:val="C0392B"/>
         </w:rPr>
-        <w:t xml:space="preserve">DRAFT — produced 2026-05-17 — synthetic data, NOT for regulatory submission</w:t>
+        <w:t xml:space="preserve">DRAFT — produced 2026-06-05 — synthetic data, NOT for regulatory submission</w:t>
       </w:r>
     </w:p>
     <w:p>
@@ -4921,7 +4921,7 @@
           <w:szCs w:val="14"/>
           <w:color w:val="C0392B"/>
         </w:rPr>
-        <w:t xml:space="preserve">DRAFT — produced 2026-05-17 — synthetic data, NOT for regulatory submission</w:t>
+        <w:t xml:space="preserve">DRAFT — produced 2026-06-05 — synthetic data, NOT for regulatory submission</w:t>
       </w:r>
     </w:p>
     <w:p>
@@ -5118,7 +5118,7 @@
           <w:szCs w:val="14"/>
           <w:color w:val="C0392B"/>
         </w:rPr>
-        <w:t xml:space="preserve">DRAFT — produced 2026-05-17 — synthetic data, NOT for regulatory submission</w:t>
+        <w:t xml:space="preserve">DRAFT — produced 2026-06-05 — synthetic data, NOT for regulatory submission</w:t>
       </w:r>
     </w:p>
     <w:p>
@@ -5315,7 +5315,7 @@
           <w:szCs w:val="14"/>
           <w:color w:val="C0392B"/>
         </w:rPr>
-        <w:t xml:space="preserve">DRAFT — produced 2026-05-17 — synthetic data, NOT for regulatory submission</w:t>
+        <w:t xml:space="preserve">DRAFT — produced 2026-06-05 — synthetic data, NOT for regulatory submission</w:t>
       </w:r>
     </w:p>
     <w:p>
@@ -5512,7 +5512,7 @@
           <w:szCs w:val="14"/>
           <w:color w:val="C0392B"/>
         </w:rPr>
-        <w:t xml:space="preserve">DRAFT — produced 2026-05-17 — synthetic data, NOT for regulatory submission</w:t>
+        <w:t xml:space="preserve">DRAFT — produced 2026-06-05 — synthetic data, NOT for regulatory submission</w:t>
       </w:r>
     </w:p>
     <w:p>
@@ -5709,7 +5709,7 @@
           <w:szCs w:val="14"/>
           <w:color w:val="C0392B"/>
         </w:rPr>
-        <w:t xml:space="preserve">DRAFT — produced 2026-05-17 — synthetic data, NOT for regulatory submission</w:t>
+        <w:t xml:space="preserve">DRAFT — produced 2026-06-05 — synthetic data, NOT for regulatory submission</w:t>
       </w:r>
     </w:p>
     <w:p>
@@ -5887,7 +5887,7 @@
           <w:szCs w:val="14"/>
           <w:color w:val="C0392B"/>
         </w:rPr>
-        <w:t xml:space="preserve">DRAFT — produced 2026-05-17 — synthetic data, NOT for regulatory submission</w:t>
+        <w:t xml:space="preserve">DRAFT — produced 2026-06-05 — synthetic data, NOT for regulatory submission</w:t>
       </w:r>
     </w:p>
     <w:p>
@@ -6065,7 +6065,7 @@
           <w:szCs w:val="14"/>
           <w:color w:val="C0392B"/>
         </w:rPr>
-        <w:t xml:space="preserve">DRAFT — produced 2026-05-17 — synthetic data, NOT for regulatory submission</w:t>
+        <w:t xml:space="preserve">DRAFT — produced 2026-06-05 — synthetic data, NOT for regulatory submission</w:t>
       </w:r>
     </w:p>
     <w:p>
@@ -6243,7 +6243,7 @@
           <w:szCs w:val="14"/>
           <w:color w:val="C0392B"/>
         </w:rPr>
-        <w:t xml:space="preserve">DRAFT — produced 2026-05-17 — synthetic data, NOT for regulatory submission</w:t>
+        <w:t xml:space="preserve">DRAFT — produced 2026-06-05 — synthetic data, NOT for regulatory submission</w:t>
       </w:r>
     </w:p>
     <w:p>
@@ -6421,7 +6421,7 @@
           <w:szCs w:val="14"/>
           <w:color w:val="C0392B"/>
         </w:rPr>
-        <w:t xml:space="preserve">DRAFT — produced 2026-05-17 — synthetic data, NOT for regulatory submission</w:t>
+        <w:t xml:space="preserve">DRAFT — produced 2026-06-05 — synthetic data, NOT for regulatory submission</w:t>
       </w:r>
     </w:p>
     <w:p>
@@ -6599,7 +6599,7 @@
           <w:szCs w:val="14"/>
           <w:color w:val="C0392B"/>
         </w:rPr>
-        <w:t xml:space="preserve">DRAFT — produced 2026-05-17 — synthetic data, NOT for regulatory submission</w:t>
+        <w:t xml:space="preserve">DRAFT — produced 2026-06-05 — synthetic data, NOT for regulatory submission</w:t>
       </w:r>
     </w:p>
     <w:p>
@@ -6777,7 +6777,7 @@
           <w:szCs w:val="14"/>
           <w:color w:val="C0392B"/>
         </w:rPr>
-        <w:t xml:space="preserve">DRAFT — produced 2026-05-17 — synthetic data, NOT for regulatory submission</w:t>
+        <w:t xml:space="preserve">DRAFT — produced 2026-06-05 — synthetic data, NOT for regulatory submission</w:t>
       </w:r>
     </w:p>
     <w:p>
@@ -6955,7 +6955,7 @@
           <w:szCs w:val="14"/>
           <w:color w:val="C0392B"/>
         </w:rPr>
-        <w:t xml:space="preserve">DRAFT — produced 2026-05-17 — synthetic data, NOT for regulatory submission</w:t>
+        <w:t xml:space="preserve">DRAFT — produced 2026-06-05 — synthetic data, NOT for regulatory submission</w:t>
       </w:r>
     </w:p>
     <w:p>
@@ -7133,7 +7133,7 @@
           <w:szCs w:val="14"/>
           <w:color w:val="C0392B"/>
         </w:rPr>
-        <w:t xml:space="preserve">DRAFT — produced 2026-05-17 — synthetic data, NOT for regulatory submission</w:t>
+        <w:t xml:space="preserve">DRAFT — produced 2026-06-05 — synthetic data, NOT for regulatory submission</w:t>
       </w:r>
     </w:p>
     <w:p>
@@ -7311,7 +7311,7 @@
           <w:szCs w:val="14"/>
           <w:color w:val="C0392B"/>
         </w:rPr>
-        <w:t xml:space="preserve">DRAFT — produced 2026-05-17 — synthetic data, NOT for regulatory submission</w:t>
+        <w:t xml:space="preserve">DRAFT — produced 2026-06-05 — synthetic data, NOT for regulatory submission</w:t>
       </w:r>
     </w:p>
     <w:p>
@@ -7489,7 +7489,7 @@
           <w:szCs w:val="14"/>
           <w:color w:val="C0392B"/>
         </w:rPr>
-        <w:t xml:space="preserve">DRAFT — produced 2026-05-17 — synthetic data, NOT for regulatory submission</w:t>
+        <w:t xml:space="preserve">DRAFT — produced 2026-06-05 — synthetic data, NOT for regulatory submission</w:t>
       </w:r>
     </w:p>
     <w:p>
@@ -7667,7 +7667,7 @@
           <w:szCs w:val="14"/>
           <w:color w:val="C0392B"/>
         </w:rPr>
-        <w:t xml:space="preserve">DRAFT — produced 2026-05-17 — synthetic data, NOT for regulatory submission</w:t>
+        <w:t xml:space="preserve">DRAFT — produced 2026-06-05 — synthetic data, NOT for regulatory submission</w:t>
       </w:r>
     </w:p>
     <w:p>
@@ -7845,7 +7845,7 @@
           <w:szCs w:val="14"/>
           <w:color w:val="C0392B"/>
         </w:rPr>
-        <w:t xml:space="preserve">DRAFT — produced 2026-05-17 — synthetic data, NOT for regulatory submission</w:t>
+        <w:t xml:space="preserve">DRAFT — produced 2026-06-05 — synthetic data, NOT for regulatory submission</w:t>
       </w:r>
     </w:p>
     <w:p>
@@ -8023,7 +8023,7 @@
           <w:szCs w:val="14"/>
           <w:color w:val="C0392B"/>
         </w:rPr>
-        <w:t xml:space="preserve">DRAFT — produced 2026-05-17 — synthetic data, NOT for regulatory submission</w:t>
+        <w:t xml:space="preserve">DRAFT — produced 2026-06-05 — synthetic data, NOT for regulatory submission</w:t>
       </w:r>
     </w:p>
     <w:p>
@@ -8201,7 +8201,7 @@
           <w:szCs w:val="14"/>
           <w:color w:val="C0392B"/>
         </w:rPr>
-        <w:t xml:space="preserve">DRAFT — produced 2026-05-17 — synthetic data, NOT for regulatory submission</w:t>
+        <w:t xml:space="preserve">DRAFT — produced 2026-06-05 — synthetic data, NOT for regulatory submission</w:t>
       </w:r>
     </w:p>
     <w:p>
@@ -8379,7 +8379,7 @@
           <w:szCs w:val="14"/>
           <w:color w:val="C0392B"/>
         </w:rPr>
-        <w:t xml:space="preserve">DRAFT — produced 2026-05-17 — synthetic data, NOT for regulatory submission</w:t>
+        <w:t xml:space="preserve">DRAFT — produced 2026-06-05 — synthetic data, NOT for regulatory submission</w:t>
       </w:r>
     </w:p>
     <w:p>
@@ -8557,7 +8557,7 @@
           <w:szCs w:val="14"/>
           <w:color w:val="C0392B"/>
         </w:rPr>
-        <w:t xml:space="preserve">DRAFT — produced 2026-05-17 — synthetic data, NOT for regulatory submission</w:t>
+        <w:t xml:space="preserve">DRAFT — produced 2026-06-05 — synthetic data, NOT for regulatory submission</w:t>
       </w:r>
     </w:p>
     <w:p>
@@ -8735,7 +8735,7 @@
           <w:szCs w:val="14"/>
           <w:color w:val="C0392B"/>
         </w:rPr>
-        <w:t xml:space="preserve">DRAFT — produced 2026-05-17 — synthetic data, NOT for regulatory submission</w:t>
+        <w:t xml:space="preserve">DRAFT — produced 2026-06-05 — synthetic data, NOT for regulatory submission</w:t>
       </w:r>
     </w:p>
     <w:p>
@@ -8913,7 +8913,7 @@
           <w:szCs w:val="14"/>
           <w:color w:val="C0392B"/>
         </w:rPr>
-        <w:t xml:space="preserve">DRAFT — produced 2026-05-17 — synthetic data, NOT for regulatory submission</w:t>
+        <w:t xml:space="preserve">DRAFT — produced 2026-06-05 — synthetic data, NOT for regulatory submission</w:t>
       </w:r>
     </w:p>
     <w:p>
@@ -9091,7 +9091,7 @@
           <w:szCs w:val="14"/>
           <w:color w:val="C0392B"/>
         </w:rPr>
-        <w:t xml:space="preserve">DRAFT — produced 2026-05-17 — synthetic data, NOT for regulatory submission</w:t>
+        <w:t xml:space="preserve">DRAFT — produced 2026-06-05 — synthetic data, NOT for regulatory submission</w:t>
       </w:r>
     </w:p>
     <w:sectPr>

</xml_diff>

<commit_message>
fix(tfl): repair death-cause + deviation cascades; regenerate all 43 outputs
The SDTM remediation dropped non-standard DD.DDTERM and DV.DVSCAT, which the TFL
suite still referenced. Fix at the source and regenerate:

- dd.R: carry the primary cause of death in the standard DDORRES/DDSTRESC (the
  result of the PRCDTH test) instead of a "Y" flag with the cause in the dropped
  DDTERM. define DDORRES length 1 -> 19; P21 unchanged (no new DD findings).
- t_ae_07_deaths.R / l_ae_02_deaths.R: read the cause from DDORRES; drop the
  cause-detail column (DDSCAT removed).
- t_dv_01_deviations.R: break down by DVDECOD (DVSCAT was 1:1 with it, dropped).

Full TFL suite re-run: 37 tables/listings + 6 figures + combined HTML/DOCX, all
43 outputs produced (exit 0). SDTM 10,981 / ADaM 10,931 unchanged.

Co-Authored-By: Claude Opus 4.8 (1M context) <noreply@anthropic.com>
Claude-Session: https://claude.ai/code/session_01X1XbsRpnoBmRduJv1Xfnxq
</commit_message>
<xml_diff>
--- a/tfl/TFL-OUTPUTS.docx
+++ b/tfl/TFL-OUTPUTS.docx
@@ -1323,7 +1323,7 @@
           <w:szCs w:val="18"/>
           <w:color w:val="C0392B"/>
         </w:rPr>
-        <w:t xml:space="preserve">DRAFT — produced 2026-06-05 — synthetic data, NOT for regulatory submission</w:t>
+        <w:t xml:space="preserve">DRAFT — produced 2026-07-19 — synthetic data, NOT for regulatory submission</w:t>
       </w:r>
     </w:p>
     <w:p>
@@ -1501,7 +1501,7 @@
           <w:szCs w:val="14"/>
           <w:color w:val="C0392B"/>
         </w:rPr>
-        <w:t xml:space="preserve">DRAFT — produced 2026-06-05 — synthetic data, NOT for regulatory submission</w:t>
+        <w:t xml:space="preserve">DRAFT — produced 2026-07-19 — synthetic data, NOT for regulatory submission</w:t>
       </w:r>
     </w:p>
     <w:p>
@@ -1679,7 +1679,7 @@
           <w:szCs w:val="14"/>
           <w:color w:val="C0392B"/>
         </w:rPr>
-        <w:t xml:space="preserve">DRAFT — produced 2026-06-05 — synthetic data, NOT for regulatory submission</w:t>
+        <w:t xml:space="preserve">DRAFT — produced 2026-07-19 — synthetic data, NOT for regulatory submission</w:t>
       </w:r>
     </w:p>
     <w:p>
@@ -1857,7 +1857,7 @@
           <w:szCs w:val="14"/>
           <w:color w:val="C0392B"/>
         </w:rPr>
-        <w:t xml:space="preserve">DRAFT — produced 2026-06-05 — synthetic data, NOT for regulatory submission</w:t>
+        <w:t xml:space="preserve">DRAFT — produced 2026-07-19 — synthetic data, NOT for regulatory submission</w:t>
       </w:r>
     </w:p>
     <w:p>
@@ -2035,7 +2035,7 @@
           <w:szCs w:val="14"/>
           <w:color w:val="C0392B"/>
         </w:rPr>
-        <w:t xml:space="preserve">DRAFT — produced 2026-06-05 — synthetic data, NOT for regulatory submission</w:t>
+        <w:t xml:space="preserve">DRAFT — produced 2026-07-19 — synthetic data, NOT for regulatory submission</w:t>
       </w:r>
     </w:p>
     <w:p>
@@ -2213,7 +2213,7 @@
           <w:szCs w:val="14"/>
           <w:color w:val="C0392B"/>
         </w:rPr>
-        <w:t xml:space="preserve">DRAFT — produced 2026-06-05 — synthetic data, NOT for regulatory submission</w:t>
+        <w:t xml:space="preserve">DRAFT — produced 2026-07-19 — synthetic data, NOT for regulatory submission</w:t>
       </w:r>
     </w:p>
     <w:p>
@@ -2391,7 +2391,7 @@
           <w:szCs w:val="14"/>
           <w:color w:val="C0392B"/>
         </w:rPr>
-        <w:t xml:space="preserve">DRAFT — produced 2026-06-05 — synthetic data, NOT for regulatory submission</w:t>
+        <w:t xml:space="preserve">DRAFT — produced 2026-07-19 — synthetic data, NOT for regulatory submission</w:t>
       </w:r>
     </w:p>
     <w:p>
@@ -2569,7 +2569,7 @@
           <w:szCs w:val="14"/>
           <w:color w:val="C0392B"/>
         </w:rPr>
-        <w:t xml:space="preserve">DRAFT — produced 2026-06-05 — synthetic data, NOT for regulatory submission</w:t>
+        <w:t xml:space="preserve">DRAFT — produced 2026-07-19 — synthetic data, NOT for regulatory submission</w:t>
       </w:r>
     </w:p>
     <w:p>
@@ -2747,7 +2747,7 @@
           <w:szCs w:val="14"/>
           <w:color w:val="C0392B"/>
         </w:rPr>
-        <w:t xml:space="preserve">DRAFT — produced 2026-06-05 — synthetic data, NOT for regulatory submission</w:t>
+        <w:t xml:space="preserve">DRAFT — produced 2026-07-19 — synthetic data, NOT for regulatory submission</w:t>
       </w:r>
     </w:p>
     <w:p>
@@ -2925,7 +2925,7 @@
           <w:szCs w:val="14"/>
           <w:color w:val="C0392B"/>
         </w:rPr>
-        <w:t xml:space="preserve">DRAFT — produced 2026-06-05 — synthetic data, NOT for regulatory submission</w:t>
+        <w:t xml:space="preserve">DRAFT — produced 2026-07-19 — synthetic data, NOT for regulatory submission</w:t>
       </w:r>
     </w:p>
     <w:p>
@@ -3103,7 +3103,7 @@
           <w:szCs w:val="14"/>
           <w:color w:val="C0392B"/>
         </w:rPr>
-        <w:t xml:space="preserve">DRAFT — produced 2026-06-05 — synthetic data, NOT for regulatory submission</w:t>
+        <w:t xml:space="preserve">DRAFT — produced 2026-07-19 — synthetic data, NOT for regulatory submission</w:t>
       </w:r>
     </w:p>
     <w:p>
@@ -3281,7 +3281,7 @@
           <w:szCs w:val="14"/>
           <w:color w:val="C0392B"/>
         </w:rPr>
-        <w:t xml:space="preserve">DRAFT — produced 2026-06-05 — synthetic data, NOT for regulatory submission</w:t>
+        <w:t xml:space="preserve">DRAFT — produced 2026-07-19 — synthetic data, NOT for regulatory submission</w:t>
       </w:r>
     </w:p>
     <w:p>
@@ -3459,7 +3459,7 @@
           <w:szCs w:val="14"/>
           <w:color w:val="C0392B"/>
         </w:rPr>
-        <w:t xml:space="preserve">DRAFT — produced 2026-06-05 — synthetic data, NOT for regulatory submission</w:t>
+        <w:t xml:space="preserve">DRAFT — produced 2026-07-19 — synthetic data, NOT for regulatory submission</w:t>
       </w:r>
     </w:p>
     <w:p>
@@ -3637,7 +3637,7 @@
           <w:szCs w:val="14"/>
           <w:color w:val="C0392B"/>
         </w:rPr>
-        <w:t xml:space="preserve">DRAFT — produced 2026-06-05 — synthetic data, NOT for regulatory submission</w:t>
+        <w:t xml:space="preserve">DRAFT — produced 2026-07-19 — synthetic data, NOT for regulatory submission</w:t>
       </w:r>
     </w:p>
     <w:p>
@@ -3815,7 +3815,7 @@
           <w:szCs w:val="14"/>
           <w:color w:val="C0392B"/>
         </w:rPr>
-        <w:t xml:space="preserve">DRAFT — produced 2026-06-05 — synthetic data, NOT for regulatory submission</w:t>
+        <w:t xml:space="preserve">DRAFT — produced 2026-07-19 — synthetic data, NOT for regulatory submission</w:t>
       </w:r>
     </w:p>
     <w:p>
@@ -3993,7 +3993,7 @@
           <w:szCs w:val="14"/>
           <w:color w:val="C0392B"/>
         </w:rPr>
-        <w:t xml:space="preserve">DRAFT — produced 2026-06-05 — synthetic data, NOT for regulatory submission</w:t>
+        <w:t xml:space="preserve">DRAFT — produced 2026-07-19 — synthetic data, NOT for regulatory submission</w:t>
       </w:r>
     </w:p>
     <w:p>
@@ -4171,7 +4171,7 @@
           <w:szCs w:val="14"/>
           <w:color w:val="C0392B"/>
         </w:rPr>
-        <w:t xml:space="preserve">DRAFT — produced 2026-06-05 — synthetic data, NOT for regulatory submission</w:t>
+        <w:t xml:space="preserve">DRAFT — produced 2026-07-19 — synthetic data, NOT for regulatory submission</w:t>
       </w:r>
     </w:p>
     <w:p>
@@ -4349,7 +4349,7 @@
           <w:szCs w:val="14"/>
           <w:color w:val="C0392B"/>
         </w:rPr>
-        <w:t xml:space="preserve">DRAFT — produced 2026-06-05 — synthetic data, NOT for regulatory submission</w:t>
+        <w:t xml:space="preserve">DRAFT — produced 2026-07-19 — synthetic data, NOT for regulatory submission</w:t>
       </w:r>
     </w:p>
     <w:p>
@@ -4527,7 +4527,7 @@
           <w:szCs w:val="14"/>
           <w:color w:val="C0392B"/>
         </w:rPr>
-        <w:t xml:space="preserve">DRAFT — produced 2026-06-05 — synthetic data, NOT for regulatory submission</w:t>
+        <w:t xml:space="preserve">DRAFT — produced 2026-07-19 — synthetic data, NOT for regulatory submission</w:t>
       </w:r>
     </w:p>
     <w:p>
@@ -4724,7 +4724,7 @@
           <w:szCs w:val="14"/>
           <w:color w:val="C0392B"/>
         </w:rPr>
-        <w:t xml:space="preserve">DRAFT — produced 2026-06-05 — synthetic data, NOT for regulatory submission</w:t>
+        <w:t xml:space="preserve">DRAFT — produced 2026-07-19 — synthetic data, NOT for regulatory submission</w:t>
       </w:r>
     </w:p>
     <w:p>
@@ -4921,7 +4921,7 @@
           <w:szCs w:val="14"/>
           <w:color w:val="C0392B"/>
         </w:rPr>
-        <w:t xml:space="preserve">DRAFT — produced 2026-06-05 — synthetic data, NOT for regulatory submission</w:t>
+        <w:t xml:space="preserve">DRAFT — produced 2026-07-19 — synthetic data, NOT for regulatory submission</w:t>
       </w:r>
     </w:p>
     <w:p>
@@ -5118,7 +5118,7 @@
           <w:szCs w:val="14"/>
           <w:color w:val="C0392B"/>
         </w:rPr>
-        <w:t xml:space="preserve">DRAFT — produced 2026-06-05 — synthetic data, NOT for regulatory submission</w:t>
+        <w:t xml:space="preserve">DRAFT — produced 2026-07-19 — synthetic data, NOT for regulatory submission</w:t>
       </w:r>
     </w:p>
     <w:p>
@@ -5315,7 +5315,7 @@
           <w:szCs w:val="14"/>
           <w:color w:val="C0392B"/>
         </w:rPr>
-        <w:t xml:space="preserve">DRAFT — produced 2026-06-05 — synthetic data, NOT for regulatory submission</w:t>
+        <w:t xml:space="preserve">DRAFT — produced 2026-07-19 — synthetic data, NOT for regulatory submission</w:t>
       </w:r>
     </w:p>
     <w:p>
@@ -5512,7 +5512,7 @@
           <w:szCs w:val="14"/>
           <w:color w:val="C0392B"/>
         </w:rPr>
-        <w:t xml:space="preserve">DRAFT — produced 2026-06-05 — synthetic data, NOT for regulatory submission</w:t>
+        <w:t xml:space="preserve">DRAFT — produced 2026-07-19 — synthetic data, NOT for regulatory submission</w:t>
       </w:r>
     </w:p>
     <w:p>
@@ -5709,7 +5709,7 @@
           <w:szCs w:val="14"/>
           <w:color w:val="C0392B"/>
         </w:rPr>
-        <w:t xml:space="preserve">DRAFT — produced 2026-06-05 — synthetic data, NOT for regulatory submission</w:t>
+        <w:t xml:space="preserve">DRAFT — produced 2026-07-19 — synthetic data, NOT for regulatory submission</w:t>
       </w:r>
     </w:p>
     <w:p>
@@ -5887,7 +5887,7 @@
           <w:szCs w:val="14"/>
           <w:color w:val="C0392B"/>
         </w:rPr>
-        <w:t xml:space="preserve">DRAFT — produced 2026-06-05 — synthetic data, NOT for regulatory submission</w:t>
+        <w:t xml:space="preserve">DRAFT — produced 2026-07-19 — synthetic data, NOT for regulatory submission</w:t>
       </w:r>
     </w:p>
     <w:p>
@@ -6065,7 +6065,7 @@
           <w:szCs w:val="14"/>
           <w:color w:val="C0392B"/>
         </w:rPr>
-        <w:t xml:space="preserve">DRAFT — produced 2026-06-05 — synthetic data, NOT for regulatory submission</w:t>
+        <w:t xml:space="preserve">DRAFT — produced 2026-07-19 — synthetic data, NOT for regulatory submission</w:t>
       </w:r>
     </w:p>
     <w:p>
@@ -6243,7 +6243,7 @@
           <w:szCs w:val="14"/>
           <w:color w:val="C0392B"/>
         </w:rPr>
-        <w:t xml:space="preserve">DRAFT — produced 2026-06-05 — synthetic data, NOT for regulatory submission</w:t>
+        <w:t xml:space="preserve">DRAFT — produced 2026-07-19 — synthetic data, NOT for regulatory submission</w:t>
       </w:r>
     </w:p>
     <w:p>
@@ -6421,7 +6421,7 @@
           <w:szCs w:val="14"/>
           <w:color w:val="C0392B"/>
         </w:rPr>
-        <w:t xml:space="preserve">DRAFT — produced 2026-06-05 — synthetic data, NOT for regulatory submission</w:t>
+        <w:t xml:space="preserve">DRAFT — produced 2026-07-19 — synthetic data, NOT for regulatory submission</w:t>
       </w:r>
     </w:p>
     <w:p>
@@ -6599,7 +6599,7 @@
           <w:szCs w:val="14"/>
           <w:color w:val="C0392B"/>
         </w:rPr>
-        <w:t xml:space="preserve">DRAFT — produced 2026-06-05 — synthetic data, NOT for regulatory submission</w:t>
+        <w:t xml:space="preserve">DRAFT — produced 2026-07-19 — synthetic data, NOT for regulatory submission</w:t>
       </w:r>
     </w:p>
     <w:p>
@@ -6777,7 +6777,7 @@
           <w:szCs w:val="14"/>
           <w:color w:val="C0392B"/>
         </w:rPr>
-        <w:t xml:space="preserve">DRAFT — produced 2026-06-05 — synthetic data, NOT for regulatory submission</w:t>
+        <w:t xml:space="preserve">DRAFT — produced 2026-07-19 — synthetic data, NOT for regulatory submission</w:t>
       </w:r>
     </w:p>
     <w:p>
@@ -6955,7 +6955,7 @@
           <w:szCs w:val="14"/>
           <w:color w:val="C0392B"/>
         </w:rPr>
-        <w:t xml:space="preserve">DRAFT — produced 2026-06-05 — synthetic data, NOT for regulatory submission</w:t>
+        <w:t xml:space="preserve">DRAFT — produced 2026-07-19 — synthetic data, NOT for regulatory submission</w:t>
       </w:r>
     </w:p>
     <w:p>
@@ -7133,7 +7133,7 @@
           <w:szCs w:val="14"/>
           <w:color w:val="C0392B"/>
         </w:rPr>
-        <w:t xml:space="preserve">DRAFT — produced 2026-06-05 — synthetic data, NOT for regulatory submission</w:t>
+        <w:t xml:space="preserve">DRAFT — produced 2026-07-19 — synthetic data, NOT for regulatory submission</w:t>
       </w:r>
     </w:p>
     <w:p>
@@ -7311,7 +7311,7 @@
           <w:szCs w:val="14"/>
           <w:color w:val="C0392B"/>
         </w:rPr>
-        <w:t xml:space="preserve">DRAFT — produced 2026-06-05 — synthetic data, NOT for regulatory submission</w:t>
+        <w:t xml:space="preserve">DRAFT — produced 2026-07-19 — synthetic data, NOT for regulatory submission</w:t>
       </w:r>
     </w:p>
     <w:p>
@@ -7489,7 +7489,7 @@
           <w:szCs w:val="14"/>
           <w:color w:val="C0392B"/>
         </w:rPr>
-        <w:t xml:space="preserve">DRAFT — produced 2026-06-05 — synthetic data, NOT for regulatory submission</w:t>
+        <w:t xml:space="preserve">DRAFT — produced 2026-07-19 — synthetic data, NOT for regulatory submission</w:t>
       </w:r>
     </w:p>
     <w:p>
@@ -7667,7 +7667,7 @@
           <w:szCs w:val="14"/>
           <w:color w:val="C0392B"/>
         </w:rPr>
-        <w:t xml:space="preserve">DRAFT — produced 2026-06-05 — synthetic data, NOT for regulatory submission</w:t>
+        <w:t xml:space="preserve">DRAFT — produced 2026-07-19 — synthetic data, NOT for regulatory submission</w:t>
       </w:r>
     </w:p>
     <w:p>
@@ -7845,7 +7845,7 @@
           <w:szCs w:val="14"/>
           <w:color w:val="C0392B"/>
         </w:rPr>
-        <w:t xml:space="preserve">DRAFT — produced 2026-06-05 — synthetic data, NOT for regulatory submission</w:t>
+        <w:t xml:space="preserve">DRAFT — produced 2026-07-19 — synthetic data, NOT for regulatory submission</w:t>
       </w:r>
     </w:p>
     <w:p>
@@ -8023,7 +8023,7 @@
           <w:szCs w:val="14"/>
           <w:color w:val="C0392B"/>
         </w:rPr>
-        <w:t xml:space="preserve">DRAFT — produced 2026-06-05 — synthetic data, NOT for regulatory submission</w:t>
+        <w:t xml:space="preserve">DRAFT — produced 2026-07-19 — synthetic data, NOT for regulatory submission</w:t>
       </w:r>
     </w:p>
     <w:p>
@@ -8201,7 +8201,7 @@
           <w:szCs w:val="14"/>
           <w:color w:val="C0392B"/>
         </w:rPr>
-        <w:t xml:space="preserve">DRAFT — produced 2026-06-05 — synthetic data, NOT for regulatory submission</w:t>
+        <w:t xml:space="preserve">DRAFT — produced 2026-07-19 — synthetic data, NOT for regulatory submission</w:t>
       </w:r>
     </w:p>
     <w:p>
@@ -8379,7 +8379,7 @@
           <w:szCs w:val="14"/>
           <w:color w:val="C0392B"/>
         </w:rPr>
-        <w:t xml:space="preserve">DRAFT — produced 2026-06-05 — synthetic data, NOT for regulatory submission</w:t>
+        <w:t xml:space="preserve">DRAFT — produced 2026-07-19 — synthetic data, NOT for regulatory submission</w:t>
       </w:r>
     </w:p>
     <w:p>
@@ -8557,7 +8557,7 @@
           <w:szCs w:val="14"/>
           <w:color w:val="C0392B"/>
         </w:rPr>
-        <w:t xml:space="preserve">DRAFT — produced 2026-06-05 — synthetic data, NOT for regulatory submission</w:t>
+        <w:t xml:space="preserve">DRAFT — produced 2026-07-19 — synthetic data, NOT for regulatory submission</w:t>
       </w:r>
     </w:p>
     <w:p>
@@ -8735,7 +8735,7 @@
           <w:szCs w:val="14"/>
           <w:color w:val="C0392B"/>
         </w:rPr>
-        <w:t xml:space="preserve">DRAFT — produced 2026-06-05 — synthetic data, NOT for regulatory submission</w:t>
+        <w:t xml:space="preserve">DRAFT — produced 2026-07-19 — synthetic data, NOT for regulatory submission</w:t>
       </w:r>
     </w:p>
     <w:p>
@@ -8913,7 +8913,7 @@
           <w:szCs w:val="14"/>
           <w:color w:val="C0392B"/>
         </w:rPr>
-        <w:t xml:space="preserve">DRAFT — produced 2026-06-05 — synthetic data, NOT for regulatory submission</w:t>
+        <w:t xml:space="preserve">DRAFT — produced 2026-07-19 — synthetic data, NOT for regulatory submission</w:t>
       </w:r>
     </w:p>
     <w:p>
@@ -9091,7 +9091,7 @@
           <w:szCs w:val="14"/>
           <w:color w:val="C0392B"/>
         </w:rPr>
-        <w:t xml:space="preserve">DRAFT — produced 2026-06-05 — synthetic data, NOT for regulatory submission</w:t>
+        <w:t xml:space="preserve">DRAFT — produced 2026-07-19 — synthetic data, NOT for regulatory submission</w:t>
       </w:r>
     </w:p>
     <w:sectPr>

</xml_diff>